<commit_message>
Changed data in report LR8
</commit_message>
<xml_diff>
--- a/LR8.docx
+++ b/LR8.docx
@@ -90,7 +90,29 @@
           <w:szCs w:val="36"/>
           <w:lang w:val="ru-RU"/>
         </w:rPr>
-        <w:t>ОТЧЁТ</w:t>
+        <w:t>ОТЧЁ</w:t>
+      </w:r>
+      <w:r>
+        <w:rPr>
+          <w:b/>
+          <w:bCs/>
+          <w:color w:val="000000"/>
+          <w:sz w:val="36"/>
+          <w:szCs w:val="36"/>
+          <w:lang w:val="ru-RU"/>
+        </w:rPr>
+        <w:t>ЁЁЁЁ</w:t>
+      </w:r>
+      <w:r>
+        <w:rPr>
+          <w:b/>
+          <w:bCs/>
+          <w:color w:val="000000"/>
+          <w:sz w:val="36"/>
+          <w:szCs w:val="36"/>
+          <w:lang w:val="ru-RU"/>
+        </w:rPr>
+        <w:t>Т</w:t>
       </w:r>
     </w:p>
     <w:p>
@@ -548,7 +570,7 @@
           <w:szCs w:val="26"/>
           <w:lang w:val="ru-RU"/>
         </w:rPr>
-        <w:t>6</w:t>
+        <w:t>5</w:t>
       </w:r>
       <w:r>
         <w:rPr>
@@ -692,9 +714,11 @@
           <w:szCs w:val="28"/>
           <w:lang w:val="ru-RU"/>
         </w:rPr>
-        <w:t xml:space="preserve">Дана информация о нескольких студентах. Запись имеет вид: фамилия, год </w:t>
-      </w:r>
-      <w:r>
+        <w:t>Дана информация о нескольких студентах. Запись имеет вид: фамилия, год рождения, факультет. Вывести данные о студентах по факультетам.</w:t>
+      </w:r>
+    </w:p>
+    <w:p>
+      <w:pPr>
         <w:rPr>
           <w:rFonts w:ascii="Times New Roman" w:hAnsi="Times New Roman" w:cs="Times New Roman"/>
           <w:bCs/>
@@ -702,64 +726,23 @@
           <w:szCs w:val="28"/>
           <w:lang w:val="ru-RU"/>
         </w:rPr>
-        <w:t>рождения, факультет</w:t>
-      </w:r>
-      <w:r>
+      </w:pPr>
+    </w:p>
+    <w:p>
+      <w:pPr>
+        <w:ind w:left="-567"/>
         <w:rPr>
           <w:rFonts w:ascii="Times New Roman" w:hAnsi="Times New Roman" w:cs="Times New Roman"/>
           <w:bCs/>
           <w:sz w:val="28"/>
           <w:szCs w:val="28"/>
-          <w:lang w:val="ru-RU"/>
-        </w:rPr>
-        <w:t xml:space="preserve">. Вывести </w:t>
-      </w:r>
+        </w:rPr>
+      </w:pPr>
       <w:r>
         <w:rPr>
           <w:rFonts w:ascii="Times New Roman" w:hAnsi="Times New Roman" w:cs="Times New Roman"/>
           <w:bCs/>
-          <w:sz w:val="28"/>
-          <w:szCs w:val="28"/>
-          <w:lang w:val="ru-RU"/>
-        </w:rPr>
-        <w:t>данные</w:t>
-      </w:r>
-      <w:r>
-        <w:rPr>
-          <w:rFonts w:ascii="Times New Roman" w:hAnsi="Times New Roman" w:cs="Times New Roman"/>
-          <w:bCs/>
-          <w:sz w:val="28"/>
-          <w:szCs w:val="28"/>
-          <w:lang w:val="ru-RU"/>
-        </w:rPr>
-        <w:t xml:space="preserve"> о студентах по факультетам.</w:t>
-      </w:r>
-    </w:p>
-    <w:p>
-      <w:pPr>
-        <w:rPr>
-          <w:rFonts w:ascii="Times New Roman" w:hAnsi="Times New Roman" w:cs="Times New Roman"/>
-          <w:bCs/>
-          <w:sz w:val="28"/>
-          <w:szCs w:val="28"/>
-          <w:lang w:val="ru-RU"/>
-        </w:rPr>
-      </w:pPr>
-    </w:p>
-    <w:p>
-      <w:pPr>
-        <w:ind w:left="-567"/>
-        <w:rPr>
-          <w:rFonts w:ascii="Times New Roman" w:hAnsi="Times New Roman" w:cs="Times New Roman"/>
-          <w:bCs/>
-          <w:sz w:val="28"/>
-          <w:szCs w:val="28"/>
-        </w:rPr>
-      </w:pPr>
-      <w:r>
-        <w:rPr>
-          <w:rFonts w:ascii="Times New Roman" w:hAnsi="Times New Roman" w:cs="Times New Roman"/>
-          <w:bCs/>
+          <w:noProof/>
           <w:sz w:val="28"/>
           <w:szCs w:val="28"/>
         </w:rPr>
@@ -803,6 +786,7 @@
         <w:rPr>
           <w:rFonts w:ascii="Times New Roman" w:hAnsi="Times New Roman" w:cs="Times New Roman"/>
           <w:bCs/>
+          <w:noProof/>
           <w:sz w:val="28"/>
           <w:szCs w:val="28"/>
         </w:rPr>

</xml_diff>